<commit_message>
Round-9 hostile-review fixes (codex-astra)
- Ship the full audit chain: pull manifests/ subdirectories (onnx,
  engines, runs, plans, calibration, annotations, splits, images, ...) and
  outputs/metrics/ leaf metric records so every config reference and
  cell_points.json resolves inside the checkout.
- Regenerate Highlights.docx and Cover_Letter.docx from the current
  Neural Networks text sources (they held stale CVIU-era content).
- Data availability wording: artifacts are hash-bound in the accompanying
  package and deposited under the concept DOI, which currently resolves
  to v2.1.0 pending the Neural Networks release.
- Correct repair naming: the tested repair is corruption-aware
  calibration; clean-only calibration is the hypothesized cause, not the
  remedy.
- Scope generator_config_sha256 claim to the corruption/q95 calibration
  manifests.

Generated with [Devin](https://devin.ai)

Co-Authored-By: Devin <158243242+devin-ai-integration[bot]@users.noreply.github.com>
</commit_message>
<xml_diff>
--- a/paper/Cover_Letter.docx
+++ b/paper/Cover_Letter.docx
@@ -8,7 +8,7 @@
         <w:jc w:val="right"/>
       </w:pPr>
       <w:r>
-        <w:t>3 September 2026</w:t>
+        <w:t>25 September 2026</w:t>
       </w:r>
     </w:p>
     <w:p>
@@ -16,7 +16,7 @@
         <w:spacing w:after="160"/>
       </w:pPr>
       <w:r>
-        <w:t>Dear Editors of Computer Vision and Image Understanding,</w:t>
+        <w:t>Dear Editors of Neural Networks,</w:t>
       </w:r>
     </w:p>
     <w:p>
@@ -24,7 +24,7 @@
         <w:spacing w:after="160"/>
       </w:pPr>
       <w:r>
-        <w:t>Please consider our manuscript, “A Paired, Floor-Guarded Evaluation Protocol for INT8 and FP8 Object Detectors under Image Corruptions,” for publication as a research article in Computer Vision and Image Understanding.</w:t>
+        <w:t>Please consider our manuscript, "Recipe determinants of quantization fragility under image corruption: paired evidence and a regression-head localization in object detectors," for publication as a research article in Neural Networks.</w:t>
       </w:r>
     </w:p>
     <w:p>
@@ -32,7 +32,7 @@
         <w:spacing w:after="160"/>
       </w:pPr>
       <w:r>
-        <w:t>Reliable evaluation of a deployed vision system requires separating a performance difference already present on nominal images from a change associated with visual degradation. We address this measurement problem for executable INT8 and FP8 object detectors. Our byte-matched, image-paired four-cell protocol subtracts the matched-clean treatment gap from the corrupted-input gap within common-image bootstrap samples. The resulting quantity is an algebraic interaction contrast, not a causal estimator, and is interpreted only after clean fidelity and absolute corrupted accuracy have been checked.</w:t>
+        <w:t>Deployment of low-precision neural networks raises a reliability question that current evaluation practice answers ambiguously: whether an 8-bit quantized detector remains reliable under corrupted inputs depends on how the engine was built, not only on the datatype label. We make this concrete with a paired, codec-controlled protocol in which every corrupted input is paired with a JPEG-95 clean control and identical encoded bytes reach both precision treatments, and the corruption-associated change in the FP8-INT8 average-precision gap is estimated inside common-image bootstrap samples.</w:t>
       </w:r>
     </w:p>
     <w:p>
@@ -40,7 +40,7 @@
         <w:spacing w:after="160"/>
       </w:pPr>
       <w:r>
-        <w:t>The exploratory grid contains 144 conditions across four datasets, three YOLO11 capacities, four synthetic corruptions, and three severities. We separately examine post-selection evaluation on final VOC/KITTI images excluded from checkpoint selection, interaction-scale and corruption-materialization sensitivities, training and calibration seeds, aggregation and class composition, matched engine runtime, and recipe-portability stress tests with RT-DETR and RetinaNet. Although the raw corrupted gap favors FP8 in 134 of 144 exploratory conditions, clean adjustment produces 56 point-estimate sign reversals; 17 adjusted intervals lie entirely below zero and 39 cross zero. FP8 outperforms INT8 by 1.40 matched-clean average-precision points on average, whereas the balanced adjusted interaction is -0.02 points in the broader grid and -0.55 points on the VOC/KITTI final holdouts. Absolute accuracy nevertheless decreases in 282 of 288 corrupted arms, demonstrating why scale-explicit interactions and remaining task performance must be reported together.</w:t>
+        <w:t>Three findings support the submission. First, under a frozen paired analysis of YOLO11n/m/x on KITTI, VOC, and a 2,000-image COCO subset, the interaction reverses sign across dataset-by-scale cells, so no universal INT8-versus-FP8 robustness ranking exists on this evidence. Second, a matched-recipe decomposition of RetinaNet localizes a severe INT8 collapse (-21.2 AP on KITTI) to regression-head quantization; excluding that head alone restores clean-competitive accuracy without retraining. Third, a controlled two-fold calibration intervention---calibrating INT8 on corruption-augmented images and testing on held-out corruption families under complementary splits, with codec-matched calibration controls---shows the intervention itself is context-dependent (transferring in one fold-by-dataset cell, significantly harming another), so corruption-aware calibration is not supported as a reliable repair and clean-only calibration ranges are not supported as the dominant repairable cause. The paper therefore converts a measurement observation into a validated localization with a practical selective-precision recipe, with deployment cost explicitly left unevaluated.</w:t>
       </w:r>
     </w:p>
     <w:p>
@@ -48,7 +48,7 @@
         <w:spacing w:after="160"/>
       </w:pPr>
       <w:r>
-        <w:t>The manuscript fits the journal’s focus on recognition and complete vision systems because its primary contribution is an auditable evaluation methodology under visual degradation, rather than a vendor-specific datatype leaderboard. The protocol generalizes to comparisons of quantizers, mixed-precision policies, compilers, calibration methods, and runtimes whenever a pre-existing clean difference can be confused with a degradation-specific effect.</w:t>
+        <w:t>The work fits Neural Networks' scope on the reliability and deployment behavior of neural network models: it treats quantization as a property of the executable recipe, identifies the fragile network region, and tests a calibrated intervention under frozen decision rules, rather than reporting a format leaderboard.</w:t>
       </w:r>
     </w:p>
     <w:p>
@@ -56,7 +56,7 @@
         <w:spacing w:after="160"/>
       </w:pPr>
       <w:r>
-        <w:t>The manuscript is original, is not under consideration elsewhere, and all six authors have approved its submission. The research received no specific grant from funding agencies in the public, commercial, or not-for-profit sectors. Code and compact evidence for release v2.1.0 are archived at DOI 10.5281/zenodo.22275640 under concept DOI 10.5281/zenodo.22031663. The manuscript contains data-and-code, funding, competing-interest, CRediT, and generative-AI declarations.</w:t>
+        <w:t>The manuscript is original, is not under consideration elsewhere, and all six authors have approved its submission. The research received no specific grant from funding agencies in the public, commercial, or not-for-profit sectors. Code and compact evidence accompany the submission as a hash-bound package and are deposited under the versioned concept DOI 10.5281/zenodo.22031663 (currently resolving to the prior release v2.1.0; the present release mints on publication); raw datasets, checkpoints, built engines, and raw predictions are not redistributed, with their regeneration boundaries documented. The manuscript contains data-and-code, funding, competing-interest, CRediT, and generative-AI declarations.</w:t>
       </w:r>
     </w:p>
     <w:p>

</xml_diff>

<commit_message>
Opus round-2 fixes: Table 3 TF32 caption, scoped conclusion/highlight, FP8-legacy registration
- Table 3 caption: TF32 wording aligned with tensorrt_python builder (no --noTF32 flag was involved)
- Conclusion and highlight 3 scoped to KITTI; codec-anchored held-out ΔE now says "both datasets"
- "near-null KITTI blocks" -> "blocks that do not survive Holm" (kitti-m was unadjusted-significant)
- FP8-legacy registered as a context-only arm in main text and Table S1
- ΔE contrasts described as same-policy quantized arms; RE-mean CI labeled Wald
- Fig. 4 tick labels rotated further; RetJCleanFid now covers phase_cd
- Stats note: correlation-bias direction described as unverified
- DOCX uploads regenerated; manifest refreshed (121 entries, all verified)

Generated with [Devin](https://devin.ai)

Co-Authored-By: Devin <158243242+devin-ai-integration[bot]@users.noreply.github.com>
</commit_message>
<xml_diff>
--- a/paper/Cover_Letter.docx
+++ b/paper/Cover_Letter.docx
@@ -3,119 +3,92 @@
 <w:document xmlns:wpc="http://schemas.microsoft.com/office/word/2010/wordprocessingCanvas" xmlns:mo="http://schemas.microsoft.com/office/mac/office/2008/main" xmlns:mc="http://schemas.openxmlformats.org/markup-compatibility/2006" xmlns:mv="urn:schemas-microsoft-com:mac:vml" xmlns:o="urn:schemas-microsoft-com:office:office" xmlns:r="http://schemas.openxmlformats.org/officeDocument/2006/relationships" xmlns:m="http://schemas.openxmlformats.org/officeDocument/2006/math" xmlns:v="urn:schemas-microsoft-com:vml" xmlns:wp14="http://schemas.microsoft.com/office/word/2010/wordprocessingDrawing" xmlns:wp="http://schemas.openxmlformats.org/drawingml/2006/wordprocessingDrawing" xmlns:w10="urn:schemas-microsoft-com:office:word" xmlns:w="http://schemas.openxmlformats.org/wordprocessingml/2006/main" xmlns:w14="http://schemas.microsoft.com/office/word/2010/wordml" xmlns:wpg="http://schemas.microsoft.com/office/word/2010/wordprocessingGroup" xmlns:wpi="http://schemas.microsoft.com/office/word/2010/wordprocessingInk" xmlns:wne="http://schemas.microsoft.com/office/word/2006/wordml" xmlns:wps="http://schemas.microsoft.com/office/word/2010/wordprocessingShape" mc:Ignorable="w14 wp14">
   <w:body>
     <w:p>
-      <w:pPr>
-        <w:spacing w:after="160"/>
-        <w:jc w:val="right"/>
-      </w:pPr>
       <w:r>
         <w:t>25 September 2026</w:t>
       </w:r>
     </w:p>
+    <w:p/>
     <w:p>
-      <w:pPr>
-        <w:spacing w:after="160"/>
-      </w:pPr>
       <w:r>
         <w:t>Dear Editors of Neural Networks,</w:t>
       </w:r>
     </w:p>
+    <w:p/>
     <w:p>
-      <w:pPr>
-        <w:spacing w:after="160"/>
-      </w:pPr>
       <w:r>
         <w:t>Please consider our manuscript, "Recipe determinants of quantization fragility under image corruption: paired evidence and a regression-head localization in object detectors," for publication as a research article in Neural Networks.</w:t>
       </w:r>
     </w:p>
+    <w:p/>
     <w:p>
-      <w:pPr>
-        <w:spacing w:after="160"/>
-      </w:pPr>
       <w:r>
         <w:t>Deployment of low-precision neural networks raises a reliability question that current evaluation practice answers ambiguously: whether an 8-bit quantized detector remains reliable under corrupted inputs depends on how the engine was built, not only on the datatype label. We make this concrete with a paired, codec-controlled protocol in which every corrupted input is paired with a JPEG-95 clean control and identical encoded bytes reach both precision treatments, and the corruption-associated change in the FP8-INT8 average-precision gap is estimated inside common-image bootstrap samples.</w:t>
       </w:r>
     </w:p>
+    <w:p/>
     <w:p>
-      <w:pPr>
-        <w:spacing w:after="160"/>
-      </w:pPr>
       <w:r>
         <w:t>Three findings support the submission. First, under a frozen paired analysis of YOLO11n/m/x on KITTI, VOC, and a 2,000-image COCO subset, the interaction reverses sign across dataset-by-scale cells while FP8 exceeds INT8 on absolute AP in every block mean, so the corruption-induced change in the gap has no format-level ordering on this evidence. Second, a matched-recipe decomposition of RetinaNet localizes a severe INT8 collapse (-21.2 AP on KITTI) to regression-head quantization; excluding that head alone restores clean-competitive accuracy without retraining---the direction replicates on VOC while the 20-AP magnitude is a KITTI estimate that carries a disclosed development-contamination caveat. Third, a controlled two-fold calibration intervention---calibrating INT8 on corruption-augmented images and testing on held-out corruption families under complementary splits, with codec-matched calibration controls---shows the intervention itself is context-dependent (transferring in one fold-by-dataset cell, significantly harming another), so corruption-aware calibration is not supported as a reliable repair and clean-only calibration ranges are not supported as the dominant repairable cause. The paper therefore converts a measurement observation into a validated localization with a practical selective-precision recipe, with deployment cost explicitly left unevaluated.</w:t>
       </w:r>
     </w:p>
+    <w:p/>
     <w:p>
-      <w:pPr>
-        <w:spacing w:after="160"/>
-      </w:pPr>
       <w:r>
         <w:t>The work fits Neural Networks' scope on the reliability and deployment behavior of neural network models: it treats quantization as a property of the executable recipe, identifies the fragile network region, and tests a calibrated intervention under frozen decision rules, rather than reporting a format leaderboard.</w:t>
       </w:r>
     </w:p>
+    <w:p/>
     <w:p>
-      <w:pPr>
-        <w:spacing w:after="160"/>
-      </w:pPr>
       <w:r>
         <w:t>The manuscript is original, is not under consideration elsewhere, and all six authors have approved its submission. The research received no specific grant from funding agencies in the public, commercial, or not-for-profit sectors. Code and compact evidence accompany the submission as a hash-bound package and are deposited under the versioned concept DOI 10.5281/zenodo.22031663 (currently resolving to the prior CVIU-era release lineage; the present release mints on publication); raw datasets, checkpoints, built engines, and raw predictions are not redistributed, with their regeneration boundaries documented. The manuscript contains data-and-code, funding, competing-interest, CRediT, and generative-AI declarations.</w:t>
       </w:r>
     </w:p>
+    <w:p/>
     <w:p>
-      <w:pPr>
-        <w:spacing w:after="160"/>
-      </w:pPr>
       <w:r>
         <w:t>Thank you for your consideration.</w:t>
       </w:r>
     </w:p>
+    <w:p/>
     <w:p>
-      <w:pPr>
-        <w:spacing w:after="160"/>
-      </w:pPr>
       <w:r>
         <w:t>Sincerely,</w:t>
       </w:r>
     </w:p>
+    <w:p/>
     <w:p>
-      <w:pPr>
-        <w:spacing w:after="160"/>
-      </w:pPr>
       <w:r>
         <w:t>Anh Vu Le</w:t>
       </w:r>
-      <w:r>
-        <w:br/>
-      </w:r>
+    </w:p>
+    <w:p>
       <w:r>
         <w:t>Corresponding author</w:t>
       </w:r>
-      <w:r>
-        <w:br/>
-      </w:r>
+    </w:p>
+    <w:p>
       <w:r>
         <w:t>Advanced Intelligent Technology Research Group</w:t>
       </w:r>
-      <w:r>
-        <w:br/>
-      </w:r>
+    </w:p>
+    <w:p>
       <w:r>
         <w:t>Faculty of Electrical and Electronics Engineering, Ton Duc Thang University</w:t>
       </w:r>
-      <w:r>
-        <w:br/>
-      </w:r>
+    </w:p>
+    <w:p>
       <w:r>
         <w:t>Ho Chi Minh City, Vietnam</w:t>
       </w:r>
-      <w:r>
-        <w:br/>
-      </w:r>
+    </w:p>
+    <w:p>
       <w:r>
         <w:t>leanhvu@tdtu.edu.vn</w:t>
       </w:r>
     </w:p>
     <w:sectPr>
-      <w:pgSz w:w="11906" w:h="16838"/>
-      <w:pgMar w:top="1152" w:right="1296" w:bottom="1152" w:left="1296" w:header="720" w:footer="720" w:gutter="0"/>
+      <w:pgSz w:w="12240" w:h="15840"/>
+      <w:pgMar w:top="1440" w:right="1800" w:bottom="1440" w:left="1800" w:header="720" w:footer="720" w:gutter="0"/>
       <w:cols w:space="720"/>
       <w:docGrid w:linePitch="360"/>
     </w:sectPr>
@@ -486,10 +459,6 @@
     <w:name w:val="Normal"/>
     <w:qFormat/>
     <w:rsid w:val="00FC693F"/>
-    <w:rPr>
-      <w:rFonts w:ascii="Times New Roman" w:hAnsi="Times New Roman"/>
-      <w:sz w:val="22"/>
-    </w:rPr>
   </w:style>
   <w:style w:type="paragraph" w:styleId="Header">
     <w:name w:val="header"/>

</xml_diff>

<commit_message>
v3.0.3: post-hoc KITTI holdout replication + FCOS activation evidence
- Phase L holdout eval: 4 arms x 14 conditions on 1,197 held-out KITTI
  images; selective-minus-matched +30.54 AP clean / +21.18 corrupt mean
  (point estimates, frame-level split)
- FCOS activation captures (KITTI+VOC): regression-head P3/P4 kurtosis
  14.4/11.3 and 3.8/4.7 vs RetinaNet 427.5/208.1 -- distribution-level
  consistency for the fine-level heavy-tail mechanism
- Per-level actstats tables/macros, Q/DQ per-level scale report
- PDF text layer fixed (glyphtounicode + STIX via TeX Live 2026)
- Highlights/cover letter/metadata aligned to v3.0.3 DOI 23082850

Generated with [Devin](https://devin.ai)

Co-Authored-By: Devin <158243242+devin-ai-integration[bot]@users.noreply.github.com>
</commit_message>
<xml_diff>
--- a/paper/Cover_Letter.docx
+++ b/paper/Cover_Letter.docx
@@ -3,92 +3,119 @@
 <w:document xmlns:wpc="http://schemas.microsoft.com/office/word/2010/wordprocessingCanvas" xmlns:mo="http://schemas.microsoft.com/office/mac/office/2008/main" xmlns:mc="http://schemas.openxmlformats.org/markup-compatibility/2006" xmlns:mv="urn:schemas-microsoft-com:mac:vml" xmlns:o="urn:schemas-microsoft-com:office:office" xmlns:r="http://schemas.openxmlformats.org/officeDocument/2006/relationships" xmlns:m="http://schemas.openxmlformats.org/officeDocument/2006/math" xmlns:v="urn:schemas-microsoft-com:vml" xmlns:wp14="http://schemas.microsoft.com/office/word/2010/wordprocessingDrawing" xmlns:wp="http://schemas.openxmlformats.org/drawingml/2006/wordprocessingDrawing" xmlns:w10="urn:schemas-microsoft-com:office:word" xmlns:w="http://schemas.openxmlformats.org/wordprocessingml/2006/main" xmlns:w14="http://schemas.microsoft.com/office/word/2010/wordml" xmlns:wpg="http://schemas.microsoft.com/office/word/2010/wordprocessingGroup" xmlns:wpi="http://schemas.microsoft.com/office/word/2010/wordprocessingInk" xmlns:wne="http://schemas.microsoft.com/office/word/2006/wordml" xmlns:wps="http://schemas.microsoft.com/office/word/2010/wordprocessingShape" mc:Ignorable="w14 wp14">
   <w:body>
     <w:p>
+      <w:pPr>
+        <w:spacing w:after="160"/>
+        <w:jc w:val="right"/>
+      </w:pPr>
       <w:r>
-        <w:t>25 September 2026</w:t>
+        <w:t>1 October 2026</w:t>
       </w:r>
     </w:p>
-    <w:p/>
     <w:p>
+      <w:pPr>
+        <w:spacing w:after="160"/>
+      </w:pPr>
       <w:r>
         <w:t>Dear Editors of Neural Networks,</w:t>
       </w:r>
     </w:p>
-    <w:p/>
     <w:p>
+      <w:pPr>
+        <w:spacing w:after="160"/>
+      </w:pPr>
       <w:r>
-        <w:t>Please consider our manuscript, "Recipe determinants of quantization fragility under image corruption: paired evidence and a regression-head localization in object detectors," for publication as a research article in Neural Networks.</w:t>
+        <w:t>Please consider our manuscript, "Quantization fragility under image corruption is recipe-dependent: paired evidence from INT8 and FP8 object detectors," for publication as a research article in Neural Networks.</w:t>
       </w:r>
     </w:p>
-    <w:p/>
     <w:p>
+      <w:pPr>
+        <w:spacing w:after="160"/>
+      </w:pPr>
       <w:r>
         <w:t>Deployment of low-precision neural networks raises a reliability question that current evaluation practice answers ambiguously: whether an 8-bit quantized detector remains reliable under corrupted inputs depends on how the engine was built, not only on the datatype label. We make this concrete with a paired, codec-controlled protocol in which every corrupted input is paired with a JPEG-95 clean control and identical encoded bytes reach both precision treatments, and the corruption-associated change in the FP8-INT8 average-precision gap is estimated inside common-image bootstrap samples.</w:t>
       </w:r>
     </w:p>
-    <w:p/>
     <w:p>
+      <w:pPr>
+        <w:spacing w:after="160"/>
+      </w:pPr>
       <w:r>
-        <w:t>Three findings support the submission. First, under a frozen paired analysis of YOLO11n/m/x on KITTI, VOC, and a 2,000-image COCO subset, the interaction reverses sign across dataset-by-scale cells while FP8 exceeds INT8 on absolute AP in every block mean, so the corruption-induced change in the gap has no format-level ordering on this evidence. Second, a matched-recipe decomposition of RetinaNet localizes a severe INT8 collapse (-21.2 AP on KITTI) to regression-head quantization; excluding that head alone restores clean-competitive accuracy without retraining---the direction replicates on VOC while the 20-AP magnitude is a KITTI estimate that carries a disclosed development-contamination caveat. Third, a controlled two-fold calibration intervention---calibrating INT8 on corruption-augmented images and testing on held-out corruption families under complementary splits, with codec-matched calibration controls---shows the intervention itself is context-dependent (transferring in one fold-by-dataset cell, significantly harming another), so corruption-aware calibration is not supported as a reliable repair and clean-only calibration ranges are not supported as the dominant repairable cause. The paper therefore converts a measurement observation into a validated localization with a practical selective-precision recipe, with deployment cost explicitly left unevaluated.</w:t>
+        <w:t>Three findings support the submission. First, under a frozen paired analysis of YOLO11n/m/x on KITTI, VOC, and a 2,000-image COCO subset, the interaction reverses sign across dataset-by-scale cells while FP8 exceeds INT8 on absolute AP in every block mean, so the corruption-induced change in the gap has no format-level ordering on this evidence. Second, a matched-recipe decomposition of RetinaNet localizes a severe INT8 collapse (-21.2 AP on the KITTI selection partition) to regression-head quantization; a post-hoc operand factorial attributes essentially all of it to activation quantization, while FCOS shows no comparable head-specific deficit. The localization and W/A pattern recur at point-estimate level on the untouched 1,197-image KITTI final holdout (selective-minus-matched +30.54 AP clean and +21.18 AP on the corruption mean; no bootstrap intervals), which was excluded from model and recipe development but is frame-level rather than sequence-disjoint. A significant VOC residual remains, and both the RetinaNet localization and FCOS boundary recur on off-the-shelf COCO-pretrained checkpoints without evaluation-set checkpoint selection. Third, a controlled two-fold calibration intervention---calibrating INT8 on corruption-augmented images and testing on held-out corruption families under complementary splits, with codec-matched calibration controls---shows the intervention itself is context-dependent (transferring in one fold-by-dataset cell, significantly harming another), so corruption-aware calibration is not supported as a reliable repair and clean-only calibration ranges are not supported as the dominant repairable cause. The paper therefore converts a measurement observation into a validated localization with a practical selective-precision recipe, whose deployment cost is bounded by an idle-gated single-host latency audit rather than left unevaluated.</w:t>
       </w:r>
     </w:p>
-    <w:p/>
     <w:p>
+      <w:pPr>
+        <w:spacing w:after="160"/>
+      </w:pPr>
       <w:r>
         <w:t>The work fits Neural Networks' scope on the reliability and deployment behavior of neural network models: it treats quantization as a property of the executable recipe, identifies the fragile network region, and tests a calibrated intervention under frozen decision rules, rather than reporting a format leaderboard.</w:t>
       </w:r>
     </w:p>
-    <w:p/>
     <w:p>
+      <w:pPr>
+        <w:spacing w:after="160"/>
+      </w:pPr>
       <w:r>
-        <w:t>The manuscript is original, is not under consideration elsewhere, and all six authors have approved its submission. The research received no specific grant from funding agencies in the public, commercial, or not-for-profit sectors. Code and compact evidence accompany the submission as a hash-bound package and are deposited under the versioned concept DOI 10.5281/zenodo.22031663 (currently resolving to the prior CVIU-era release lineage; the present release mints on publication); raw datasets, checkpoints, built engines, and raw predictions are not redistributed, with their regeneration boundaries documented. The manuscript contains data-and-code, funding, competing-interest, CRediT, and generative-AI declarations.</w:t>
+        <w:t>The manuscript is original, is not under consideration elsewhere, and all six authors have approved its submission. The research received no specific grant from funding agencies in the public, commercial, or not-for-profit sectors. The revised manuscript, sources, and hash-bound evidence accompany immutable release v3.0.3 (version DOI 10.5281/zenodo.23082850) under concept DOI 10.5281/zenodo.22031663. Raw datasets, checkpoints, built engines, ONNX graphs, and raw predictions are not redistributed; their provenance and regeneration boundaries are documented. The manuscript contains data-and-code, funding, competing-interest, CRediT, and generative-AI declarations.</w:t>
       </w:r>
     </w:p>
-    <w:p/>
     <w:p>
+      <w:pPr>
+        <w:spacing w:after="160"/>
+      </w:pPr>
       <w:r>
         <w:t>Thank you for your consideration.</w:t>
       </w:r>
     </w:p>
-    <w:p/>
     <w:p>
+      <w:pPr>
+        <w:spacing w:after="160"/>
+      </w:pPr>
       <w:r>
         <w:t>Sincerely,</w:t>
       </w:r>
     </w:p>
-    <w:p/>
     <w:p>
+      <w:pPr>
+        <w:spacing w:after="160"/>
+      </w:pPr>
       <w:r>
         <w:t>Anh Vu Le</w:t>
       </w:r>
-    </w:p>
-    <w:p>
+      <w:r>
+        <w:br/>
+      </w:r>
       <w:r>
         <w:t>Corresponding author</w:t>
       </w:r>
-    </w:p>
-    <w:p>
+      <w:r>
+        <w:br/>
+      </w:r>
       <w:r>
         <w:t>Advanced Intelligent Technology Research Group</w:t>
       </w:r>
-    </w:p>
-    <w:p>
+      <w:r>
+        <w:br/>
+      </w:r>
       <w:r>
         <w:t>Faculty of Electrical and Electronics Engineering, Ton Duc Thang University</w:t>
       </w:r>
-    </w:p>
-    <w:p>
+      <w:r>
+        <w:br/>
+      </w:r>
       <w:r>
         <w:t>Ho Chi Minh City, Vietnam</w:t>
       </w:r>
-    </w:p>
-    <w:p>
+      <w:r>
+        <w:br/>
+      </w:r>
       <w:r>
         <w:t>leanhvu@tdtu.edu.vn</w:t>
       </w:r>
     </w:p>
     <w:sectPr>
-      <w:pgSz w:w="12240" w:h="15840"/>
-      <w:pgMar w:top="1440" w:right="1800" w:bottom="1440" w:left="1800" w:header="720" w:footer="720" w:gutter="0"/>
+      <w:pgSz w:w="11906" w:h="16838"/>
+      <w:pgMar w:top="1152" w:right="1296" w:bottom="1152" w:left="1296" w:header="720" w:footer="720" w:gutter="0"/>
       <w:cols w:space="720"/>
       <w:docGrid w:linePitch="360"/>
     </w:sectPr>
@@ -459,6 +486,10 @@
     <w:name w:val="Normal"/>
     <w:qFormat/>
     <w:rsid w:val="00FC693F"/>
+    <w:rPr>
+      <w:rFonts w:ascii="Times New Roman" w:hAnsi="Times New Roman"/>
+      <w:sz w:val="22"/>
+    </w:rPr>
   </w:style>
   <w:style w:type="paragraph" w:styleId="Header">
     <w:name w:val="header"/>

</xml_diff>

<commit_message>
v3.0.4: KITTI provenance correction, retrained holdout, drive-clustered bootstrap
- Correct the KITTI "final holdout" claim: the 1,197 images were in the
  original RetinaNet training partition (95 also in calibration); phase L is
  now described as a seen-image consistency check.
- Add a genuine holdout: RetinaNet retrained on the 4,788-image resplit list,
  six arms rebuilt and evaluated on the final partition (phase N).
- Add a drive-clustered KITTI bootstrap from the official devkit mapping
  (phase M) and a covariance-aware generalized Cochran Q.
- Script and verify the head-restricted max-calibration patch; restore the
  NN pipeline scripts and YOLO11 training inputs missing from the tree.
- Rewrite the manuscript in concise passive voice, restructure headings,
  figures and tables, and fix issues found in five Codex review rounds.

Co-Authored-By: Claude Opus 5.5 (1M context) <noreply@anthropic.com>
</commit_message>
<xml_diff>
--- a/paper/Cover_Letter.docx
+++ b/paper/Cover_Letter.docx
@@ -8,7 +8,7 @@
         <w:jc w:val="right"/>
       </w:pPr>
       <w:r>
-        <w:t>1 October 2026</w:t>
+        <w:t>2 October 2026</w:t>
       </w:r>
     </w:p>
     <w:p>
@@ -32,7 +32,7 @@
         <w:spacing w:after="160"/>
       </w:pPr>
       <w:r>
-        <w:t>Deployment of low-precision neural networks raises a reliability question that current evaluation practice answers ambiguously: whether an 8-bit quantized detector remains reliable under corrupted inputs depends on how the engine was built, not only on the datatype label. We make this concrete with a paired, codec-controlled protocol in which every corrupted input is paired with a JPEG-95 clean control and identical encoded bytes reach both precision treatments, and the corruption-associated change in the FP8-INT8 average-precision gap is estimated inside common-image bootstrap samples.</w:t>
+        <w:t>Low-precision neural networks are increasingly deployed on edge hardware, and practitioners often ask whether INT8 or FP8 is more robust to corrupted inputs. We show that the answer depends on how the engine is built and which part of the network is quantized, not on the datatype label. Our protocol pairs every corrupted input with a JPEG-95 clean control, feeds identical bytes to both precisions, and estimates the corruption-induced change in the FP8-INT8 average-precision gap inside common-image bootstrap samples.</w:t>
       </w:r>
     </w:p>
     <w:p>
@@ -40,7 +40,7 @@
         <w:spacing w:after="160"/>
       </w:pPr>
       <w:r>
-        <w:t>Three findings support the submission. First, under a frozen paired analysis of YOLO11n/m/x on KITTI, VOC, and a 2,000-image COCO subset, the interaction reverses sign across dataset-by-scale cells while FP8 exceeds INT8 on absolute AP in every block mean, so the corruption-induced change in the gap has no format-level ordering on this evidence. Second, a matched-recipe decomposition of RetinaNet localizes a severe INT8 collapse (-21.2 AP on the KITTI selection partition) to regression-head quantization; a post-hoc operand factorial attributes essentially all of it to activation quantization, while FCOS shows no comparable head-specific deficit. The localization and W/A pattern recur at point-estimate level on the untouched 1,197-image KITTI final holdout (selective-minus-matched +30.54 AP clean and +21.18 AP on the corruption mean; no bootstrap intervals), which was excluded from model and recipe development but is frame-level rather than sequence-disjoint. A significant VOC residual remains, and both the RetinaNet localization and FCOS boundary recur on off-the-shelf COCO-pretrained checkpoints without evaluation-set checkpoint selection. Third, a controlled two-fold calibration intervention---calibrating INT8 on corruption-augmented images and testing on held-out corruption families under complementary splits, with codec-matched calibration controls---shows the intervention itself is context-dependent (transferring in one fold-by-dataset cell, significantly harming another), so corruption-aware calibration is not supported as a reliable repair and clean-only calibration ranges are not supported as the dominant repairable cause. The paper therefore converts a measurement observation into a validated localization with a practical selective-precision recipe, whose deployment cost is bounded by an idle-gated single-host latency audit rather than left unevaluated.</w:t>
+        <w:t>The paper makes three main points. First, across nine YOLO11 dataset-by-scale blocks on KITTI, VOC, and a 2,000-image COCO subset, this interaction changes sign, while FP8 still has higher absolute AP in every block. Second, a matched-recipe decomposition of RetinaNet traces a severe INT8 collapse (21.2 AP on KITTI) to the regression head, and an operand factorial attributes almost all of it to activation quantization. Keeping that head in floating point repairs the deficit without retraining. FCOS shows no such deficit, and both results recur on off-the-shelf COCO-pretrained checkpoints. The pattern also replicates on a KITTI holdout scored with a checkpoint retrained without those images. Third, a two-fold corruption-aware calibration experiment with codec-matched controls helps in one fold-by-dataset cell and significantly hurts another, so it is not a reliable repair.</w:t>
       </w:r>
     </w:p>
     <w:p>
@@ -48,7 +48,7 @@
         <w:spacing w:after="160"/>
       </w:pPr>
       <w:r>
-        <w:t>The work fits Neural Networks' scope on the reliability and deployment behavior of neural network models: it treats quantization as a property of the executable recipe, identifies the fragile network region, and tests a calibrated intervention under frozen decision rules, rather than reporting a format leaderboard.</w:t>
+        <w:t>The work fits the scope of Neural Networks because it studies how quantization interacts with the internal structure of trained networks: it locates the fragile network region and the operand responsible, rather than ranking formats.</w:t>
       </w:r>
     </w:p>
     <w:p>
@@ -56,7 +56,7 @@
         <w:spacing w:after="160"/>
       </w:pPr>
       <w:r>
-        <w:t>The manuscript is original, is not under consideration elsewhere, and all six authors have approved its submission. The research received no specific grant from funding agencies in the public, commercial, or not-for-profit sectors. The revised manuscript, sources, and hash-bound evidence accompany immutable release v3.0.3 (version DOI 10.5281/zenodo.23082850) under concept DOI 10.5281/zenodo.22031663. Raw datasets, checkpoints, built engines, ONNX graphs, and raw predictions are not redistributed; their provenance and regeneration boundaries are documented. The manuscript contains data-and-code, funding, competing-interest, CRediT, and generative-AI declarations.</w:t>
+        <w:t>The manuscript is original, is not under consideration elsewhere, and all six authors have approved its submission. The research received no specific grant from funding agencies in the public, commercial, or not-for-profit sectors. Code, manuscript sources, and hash-bound evidence are archived in release v3.0.4 (version DOI 10.5281/zenodo.23097634) under concept DOI 10.5281/zenodo.22031663. Raw datasets, checkpoints, built engines, ONNX graphs, and raw predictions are not redistributed; their provenance and regeneration steps are documented. The manuscript includes data and code availability, funding, competing-interest, CRediT, and generative-AI declarations.</w:t>
       </w:r>
     </w:p>
     <w:p>

</xml_diff>